<commit_message>
Update Network Mapping And How to use file
</commit_message>
<xml_diff>
--- a/Chau/Cách export data từ sql sang excel và pivotchart.docx
+++ b/Chau/Cách export data từ sql sang excel và pivotchart.docx
@@ -5,6 +5,13 @@
     <w:p/>
     <w:p/>
     <w:p>
+      <w:pPr>
+        <w:rPr>
+          <w:b/>
+          <w:sz w:val="40"/>
+          <w:szCs w:val="40"/>
+        </w:rPr>
+      </w:pPr>
       <w:r>
         <w:rPr>
           <w:b/>
@@ -13,12 +20,43 @@
         </w:rPr>
         <w:t>Sử dụng Dbeaver</w:t>
       </w:r>
-      <w:r>
+    </w:p>
+    <w:p>
+      <w:pPr>
+        <w:rPr>
+          <w:b/>
+          <w:sz w:val="40"/>
+          <w:szCs w:val="40"/>
+        </w:rPr>
+      </w:pPr>
+      <w:r>
+        <w:rPr>
+          <w:b/>
+          <w:sz w:val="40"/>
+          <w:szCs w:val="40"/>
+        </w:rPr>
+        <w:t>Vào File-&gt;Open file-&gt;chọn file db từ SQL-&gt;Open</w:t>
+      </w:r>
+    </w:p>
+    <w:p>
+      <w:pPr>
+        <w:rPr>
+          <w:b/>
+          <w:sz w:val="40"/>
+          <w:szCs w:val="40"/>
+        </w:rPr>
+      </w:pPr>
+      <w:r>
+        <w:rPr>
+          <w:b/>
+          <w:sz w:val="40"/>
+          <w:szCs w:val="40"/>
+        </w:rPr>
         <w:drawing>
-          <wp:inline distT="0" distB="0" distL="0" distR="0" wp14:anchorId="68B631FD" wp14:editId="30A8AE46">
-            <wp:extent cx="5943600" cy="3213100"/>
-            <wp:effectExtent l="0" t="0" r="0" b="6350"/>
-            <wp:docPr id="1" name="Picture 1"/>
+          <wp:inline distT="0" distB="0" distL="0" distR="0" wp14:anchorId="53B4589D" wp14:editId="0815D8D4">
+            <wp:extent cx="5943600" cy="3355975"/>
+            <wp:effectExtent l="0" t="0" r="0" b="0"/>
+            <wp:docPr id="8" name="Picture 8"/>
             <wp:cNvGraphicFramePr>
               <a:graphicFrameLocks xmlns:a="http://schemas.openxmlformats.org/drawingml/2006/main" noChangeAspect="1"/>
             </wp:cNvGraphicFramePr>
@@ -38,7 +76,7 @@
                   <pic:spPr>
                     <a:xfrm>
                       <a:off x="0" y="0"/>
-                      <a:ext cx="5943600" cy="3213100"/>
+                      <a:ext cx="5943600" cy="3355975"/>
                     </a:xfrm>
                     <a:prstGeom prst="rect">
                       <a:avLst/>
@@ -65,16 +103,12 @@
           <w:sz w:val="40"/>
           <w:szCs w:val="40"/>
         </w:rPr>
-        <w:t>Export data</w:t>
-      </w:r>
-    </w:p>
-    <w:p>
-      <w:r>
+        <w:lastRenderedPageBreak/>
         <w:drawing>
-          <wp:inline distT="0" distB="0" distL="0" distR="0" wp14:anchorId="74DB14DA" wp14:editId="0C643747">
-            <wp:extent cx="5943600" cy="3226435"/>
+          <wp:inline distT="0" distB="0" distL="0" distR="0" wp14:anchorId="17DF7330" wp14:editId="31C360F3">
+            <wp:extent cx="5943600" cy="3316605"/>
             <wp:effectExtent l="0" t="0" r="0" b="0"/>
-            <wp:docPr id="2" name="Picture 2"/>
+            <wp:docPr id="9" name="Picture 9"/>
             <wp:cNvGraphicFramePr>
               <a:graphicFrameLocks xmlns:a="http://schemas.openxmlformats.org/drawingml/2006/main" noChangeAspect="1"/>
             </wp:cNvGraphicFramePr>
@@ -94,7 +128,7 @@
                   <pic:spPr>
                     <a:xfrm>
                       <a:off x="0" y="0"/>
-                      <a:ext cx="5943600" cy="3226435"/>
+                      <a:ext cx="5943600" cy="3316605"/>
                     </a:xfrm>
                     <a:prstGeom prst="rect">
                       <a:avLst/>
@@ -108,81 +142,15 @@
       </w:r>
     </w:p>
     <w:p>
-      <w:pPr>
-        <w:rPr>
-          <w:b/>
-          <w:sz w:val="40"/>
-          <w:szCs w:val="40"/>
-        </w:rPr>
-      </w:pPr>
-      <w:r>
-        <w:rPr>
-          <w:b/>
-          <w:sz w:val="40"/>
-          <w:szCs w:val="40"/>
-        </w:rPr>
-        <w:lastRenderedPageBreak/>
-        <w:t>Chọn xuất dạng XLSX</w:t>
-      </w:r>
-    </w:p>
-    <w:p>
-      <w:pPr>
-        <w:rPr>
-          <w:b/>
-          <w:sz w:val="40"/>
-          <w:szCs w:val="40"/>
-        </w:rPr>
-      </w:pPr>
-      <w:r>
-        <w:rPr>
-          <w:b/>
-          <w:sz w:val="40"/>
-          <w:szCs w:val="40"/>
-        </w:rPr>
-        <w:t>Next-&gt;Proceed</w:t>
-      </w:r>
-    </w:p>
-    <w:p>
-      <w:pPr>
-        <w:rPr>
-          <w:b/>
-          <w:sz w:val="40"/>
-          <w:szCs w:val="40"/>
-        </w:rPr>
-      </w:pPr>
-      <w:r>
-        <w:rPr>
-          <w:b/>
-          <w:sz w:val="40"/>
-          <w:szCs w:val="40"/>
-        </w:rPr>
-        <w:t>Tạo PivotChart</w:t>
-      </w:r>
-    </w:p>
-    <w:p>
-      <w:pPr>
-        <w:rPr>
-          <w:b/>
-          <w:sz w:val="40"/>
-          <w:szCs w:val="40"/>
-        </w:rPr>
-      </w:pPr>
-      <w:r>
-        <w:rPr>
-          <w:b/>
-          <w:sz w:val="40"/>
-          <w:szCs w:val="40"/>
-        </w:rPr>
-        <w:t>Chon vùng từ A1-&gt;H29</w:t>
-      </w:r>
-    </w:p>
-    <w:p>
-      <w:r>
+      <w:r>
+        <w:rPr>
+          <w:noProof/>
+        </w:rPr>
         <w:drawing>
-          <wp:inline distT="0" distB="0" distL="0" distR="0" wp14:anchorId="407A72E0" wp14:editId="7AD0459D">
-            <wp:extent cx="5943600" cy="3205480"/>
-            <wp:effectExtent l="0" t="0" r="0" b="0"/>
-            <wp:docPr id="3" name="Picture 3"/>
+          <wp:inline distT="0" distB="0" distL="0" distR="0" wp14:anchorId="68B631FD" wp14:editId="30A8AE46">
+            <wp:extent cx="5943600" cy="3213100"/>
+            <wp:effectExtent l="0" t="0" r="0" b="6350"/>
+            <wp:docPr id="1" name="Picture 1"/>
             <wp:cNvGraphicFramePr>
               <a:graphicFrameLocks xmlns:a="http://schemas.openxmlformats.org/drawingml/2006/main" noChangeAspect="1"/>
             </wp:cNvGraphicFramePr>
@@ -202,7 +170,7 @@
                   <pic:spPr>
                     <a:xfrm>
                       <a:off x="0" y="0"/>
-                      <a:ext cx="5943600" cy="3205480"/>
+                      <a:ext cx="5943600" cy="3213100"/>
                     </a:xfrm>
                     <a:prstGeom prst="rect">
                       <a:avLst/>
@@ -214,12 +182,45 @@
           </wp:inline>
         </w:drawing>
       </w:r>
-      <w:r>
+    </w:p>
+    <w:p>
+      <w:pPr>
+        <w:rPr>
+          <w:b/>
+          <w:sz w:val="40"/>
+          <w:szCs w:val="40"/>
+        </w:rPr>
+      </w:pPr>
+      <w:r>
+        <w:rPr>
+          <w:b/>
+          <w:sz w:val="40"/>
+          <w:szCs w:val="40"/>
+        </w:rPr>
+        <w:t>Kéo chọn tất cả dữ liệu-&gt;</w:t>
+      </w:r>
+      <w:bookmarkStart w:id="0" w:name="_GoBack"/>
+      <w:bookmarkEnd w:id="0"/>
+      <w:r>
+        <w:rPr>
+          <w:b/>
+          <w:sz w:val="40"/>
+          <w:szCs w:val="40"/>
+        </w:rPr>
+        <w:t>Export data</w:t>
+      </w:r>
+    </w:p>
+    <w:p>
+      <w:r>
+        <w:rPr>
+          <w:noProof/>
+        </w:rPr>
+        <w:lastRenderedPageBreak/>
         <w:drawing>
-          <wp:inline distT="0" distB="0" distL="0" distR="0" wp14:anchorId="78CA318E" wp14:editId="0886D076">
-            <wp:extent cx="5943600" cy="3204210"/>
+          <wp:inline distT="0" distB="0" distL="0" distR="0" wp14:anchorId="74DB14DA" wp14:editId="0C643747">
+            <wp:extent cx="5943600" cy="3226435"/>
             <wp:effectExtent l="0" t="0" r="0" b="0"/>
-            <wp:docPr id="4" name="Picture 4"/>
+            <wp:docPr id="2" name="Picture 2"/>
             <wp:cNvGraphicFramePr>
               <a:graphicFrameLocks xmlns:a="http://schemas.openxmlformats.org/drawingml/2006/main" noChangeAspect="1"/>
             </wp:cNvGraphicFramePr>
@@ -239,7 +240,7 @@
                   <pic:spPr>
                     <a:xfrm>
                       <a:off x="0" y="0"/>
-                      <a:ext cx="5943600" cy="3204210"/>
+                      <a:ext cx="5943600" cy="3226435"/>
                     </a:xfrm>
                     <a:prstGeom prst="rect">
                       <a:avLst/>
@@ -266,26 +267,71 @@
           <w:sz w:val="40"/>
           <w:szCs w:val="40"/>
         </w:rPr>
+        <w:t>Chọn xuất dạng XLSX</w:t>
+      </w:r>
+    </w:p>
+    <w:p>
+      <w:pPr>
+        <w:rPr>
+          <w:b/>
+          <w:sz w:val="40"/>
+          <w:szCs w:val="40"/>
+        </w:rPr>
+      </w:pPr>
+      <w:r>
+        <w:rPr>
+          <w:b/>
+          <w:sz w:val="40"/>
+          <w:szCs w:val="40"/>
+        </w:rPr>
+        <w:t>Next-&gt;Proceed</w:t>
+      </w:r>
+    </w:p>
+    <w:p>
+      <w:pPr>
+        <w:rPr>
+          <w:b/>
+          <w:sz w:val="40"/>
+          <w:szCs w:val="40"/>
+        </w:rPr>
+      </w:pPr>
+      <w:r>
+        <w:rPr>
+          <w:b/>
+          <w:sz w:val="40"/>
+          <w:szCs w:val="40"/>
+        </w:rPr>
+        <w:t>Tạo PivotChart</w:t>
+      </w:r>
+    </w:p>
+    <w:p>
+      <w:pPr>
+        <w:rPr>
+          <w:b/>
+          <w:sz w:val="40"/>
+          <w:szCs w:val="40"/>
+        </w:rPr>
+      </w:pPr>
+      <w:r>
+        <w:rPr>
+          <w:b/>
+          <w:sz w:val="40"/>
+          <w:szCs w:val="40"/>
+        </w:rPr>
+        <w:t>Chon vùng từ A1-&gt;H29</w:t>
+      </w:r>
+    </w:p>
+    <w:p>
+      <w:r>
+        <w:rPr>
+          <w:noProof/>
+        </w:rPr>
         <w:lastRenderedPageBreak/>
-        <w:t>Từ phần Pivot Charts Fields k</w:t>
-      </w:r>
-      <w:r>
-        <w:rPr>
-          <w:b/>
-          <w:sz w:val="40"/>
-          <w:szCs w:val="40"/>
-        </w:rPr>
-        <w:t>éo phần status xuống AXIS và VALUE</w:t>
-      </w:r>
-    </w:p>
-    <w:p/>
-    <w:p>
-      <w:r>
         <w:drawing>
-          <wp:inline distT="0" distB="0" distL="0" distR="0" wp14:anchorId="59DAB4E7" wp14:editId="2B5DE715">
-            <wp:extent cx="5943600" cy="3219450"/>
+          <wp:inline distT="0" distB="0" distL="0" distR="0" wp14:anchorId="407A72E0" wp14:editId="7AD0459D">
+            <wp:extent cx="5943600" cy="3205480"/>
             <wp:effectExtent l="0" t="0" r="0" b="0"/>
-            <wp:docPr id="5" name="Picture 5"/>
+            <wp:docPr id="3" name="Picture 3"/>
             <wp:cNvGraphicFramePr>
               <a:graphicFrameLocks xmlns:a="http://schemas.openxmlformats.org/drawingml/2006/main" noChangeAspect="1"/>
             </wp:cNvGraphicFramePr>
@@ -305,7 +351,7 @@
                   <pic:spPr>
                     <a:xfrm>
                       <a:off x="0" y="0"/>
-                      <a:ext cx="5943600" cy="3219450"/>
+                      <a:ext cx="5943600" cy="3205480"/>
                     </a:xfrm>
                     <a:prstGeom prst="rect">
                       <a:avLst/>
@@ -317,34 +363,15 @@
           </wp:inline>
         </w:drawing>
       </w:r>
-    </w:p>
-    <w:p>
-      <w:pPr>
-        <w:rPr>
-          <w:b/>
-          <w:sz w:val="40"/>
-          <w:szCs w:val="40"/>
-        </w:rPr>
-      </w:pPr>
-      <w:bookmarkStart w:id="0" w:name="_GoBack"/>
-      <w:r>
-        <w:rPr>
-          <w:b/>
-          <w:sz w:val="40"/>
-          <w:szCs w:val="40"/>
-        </w:rPr>
-        <w:t>Chọn kiểu biểu đồ tròn Design-&gt;Change Chart Type-&gt;Pie-&gt;Ok</w:t>
-      </w:r>
-    </w:p>
-    <w:bookmarkEnd w:id="0"/>
-    <w:p>
-      <w:r>
-        <w:lastRenderedPageBreak/>
+      <w:r>
+        <w:rPr>
+          <w:noProof/>
+        </w:rPr>
         <w:drawing>
-          <wp:inline distT="0" distB="0" distL="0" distR="0" wp14:anchorId="4D24447F" wp14:editId="5CBAE84E">
-            <wp:extent cx="5943600" cy="3188335"/>
+          <wp:inline distT="0" distB="0" distL="0" distR="0" wp14:anchorId="78CA318E" wp14:editId="0886D076">
+            <wp:extent cx="5943600" cy="3204210"/>
             <wp:effectExtent l="0" t="0" r="0" b="0"/>
-            <wp:docPr id="6" name="Picture 6"/>
+            <wp:docPr id="4" name="Picture 4"/>
             <wp:cNvGraphicFramePr>
               <a:graphicFrameLocks xmlns:a="http://schemas.openxmlformats.org/drawingml/2006/main" noChangeAspect="1"/>
             </wp:cNvGraphicFramePr>
@@ -364,7 +391,7 @@
                   <pic:spPr>
                     <a:xfrm>
                       <a:off x="0" y="0"/>
-                      <a:ext cx="5943600" cy="3188335"/>
+                      <a:ext cx="5943600" cy="3204210"/>
                     </a:xfrm>
                     <a:prstGeom prst="rect">
                       <a:avLst/>
@@ -378,12 +405,34 @@
       </w:r>
     </w:p>
     <w:p>
-      <w:r>
+      <w:pPr>
+        <w:rPr>
+          <w:b/>
+          <w:sz w:val="40"/>
+          <w:szCs w:val="40"/>
+        </w:rPr>
+      </w:pPr>
+      <w:r>
+        <w:rPr>
+          <w:b/>
+          <w:sz w:val="40"/>
+          <w:szCs w:val="40"/>
+        </w:rPr>
+        <w:t>Từ phần Pivot Charts Fields kéo phần status xuống AXIS và VALUE</w:t>
+      </w:r>
+    </w:p>
+    <w:p/>
+    <w:p>
+      <w:r>
+        <w:rPr>
+          <w:noProof/>
+        </w:rPr>
+        <w:lastRenderedPageBreak/>
         <w:drawing>
-          <wp:inline distT="0" distB="0" distL="0" distR="0" wp14:anchorId="6533B31A" wp14:editId="71AF8385">
-            <wp:extent cx="5943600" cy="3197860"/>
-            <wp:effectExtent l="0" t="0" r="0" b="2540"/>
-            <wp:docPr id="7" name="Picture 7"/>
+          <wp:inline distT="0" distB="0" distL="0" distR="0" wp14:anchorId="59DAB4E7" wp14:editId="2B5DE715">
+            <wp:extent cx="5943600" cy="3219450"/>
+            <wp:effectExtent l="0" t="0" r="0" b="0"/>
+            <wp:docPr id="5" name="Picture 5"/>
             <wp:cNvGraphicFramePr>
               <a:graphicFrameLocks xmlns:a="http://schemas.openxmlformats.org/drawingml/2006/main" noChangeAspect="1"/>
             </wp:cNvGraphicFramePr>
@@ -403,6 +452,108 @@
                   <pic:spPr>
                     <a:xfrm>
                       <a:off x="0" y="0"/>
+                      <a:ext cx="5943600" cy="3219450"/>
+                    </a:xfrm>
+                    <a:prstGeom prst="rect">
+                      <a:avLst/>
+                    </a:prstGeom>
+                  </pic:spPr>
+                </pic:pic>
+              </a:graphicData>
+            </a:graphic>
+          </wp:inline>
+        </w:drawing>
+      </w:r>
+    </w:p>
+    <w:p>
+      <w:pPr>
+        <w:rPr>
+          <w:b/>
+          <w:sz w:val="40"/>
+          <w:szCs w:val="40"/>
+        </w:rPr>
+      </w:pPr>
+      <w:r>
+        <w:rPr>
+          <w:b/>
+          <w:sz w:val="40"/>
+          <w:szCs w:val="40"/>
+        </w:rPr>
+        <w:t>Chọn kiểu biểu đồ tròn Design-&gt;Change Chart Type-&gt;Pie-&gt;Ok</w:t>
+      </w:r>
+    </w:p>
+    <w:p>
+      <w:r>
+        <w:rPr>
+          <w:noProof/>
+        </w:rPr>
+        <w:drawing>
+          <wp:inline distT="0" distB="0" distL="0" distR="0" wp14:anchorId="4D24447F" wp14:editId="5CBAE84E">
+            <wp:extent cx="5943600" cy="3188335"/>
+            <wp:effectExtent l="0" t="0" r="0" b="0"/>
+            <wp:docPr id="6" name="Picture 6"/>
+            <wp:cNvGraphicFramePr>
+              <a:graphicFrameLocks xmlns:a="http://schemas.openxmlformats.org/drawingml/2006/main" noChangeAspect="1"/>
+            </wp:cNvGraphicFramePr>
+            <a:graphic xmlns:a="http://schemas.openxmlformats.org/drawingml/2006/main">
+              <a:graphicData uri="http://schemas.openxmlformats.org/drawingml/2006/picture">
+                <pic:pic xmlns:pic="http://schemas.openxmlformats.org/drawingml/2006/picture">
+                  <pic:nvPicPr>
+                    <pic:cNvPr id="1" name=""/>
+                    <pic:cNvPicPr/>
+                  </pic:nvPicPr>
+                  <pic:blipFill>
+                    <a:blip r:embed="rId13"/>
+                    <a:stretch>
+                      <a:fillRect/>
+                    </a:stretch>
+                  </pic:blipFill>
+                  <pic:spPr>
+                    <a:xfrm>
+                      <a:off x="0" y="0"/>
+                      <a:ext cx="5943600" cy="3188335"/>
+                    </a:xfrm>
+                    <a:prstGeom prst="rect">
+                      <a:avLst/>
+                    </a:prstGeom>
+                  </pic:spPr>
+                </pic:pic>
+              </a:graphicData>
+            </a:graphic>
+          </wp:inline>
+        </w:drawing>
+      </w:r>
+    </w:p>
+    <w:p>
+      <w:r>
+        <w:rPr>
+          <w:noProof/>
+        </w:rPr>
+        <w:lastRenderedPageBreak/>
+        <w:drawing>
+          <wp:inline distT="0" distB="0" distL="0" distR="0" wp14:anchorId="6533B31A" wp14:editId="71AF8385">
+            <wp:extent cx="5943600" cy="3197860"/>
+            <wp:effectExtent l="0" t="0" r="0" b="2540"/>
+            <wp:docPr id="7" name="Picture 7"/>
+            <wp:cNvGraphicFramePr>
+              <a:graphicFrameLocks xmlns:a="http://schemas.openxmlformats.org/drawingml/2006/main" noChangeAspect="1"/>
+            </wp:cNvGraphicFramePr>
+            <a:graphic xmlns:a="http://schemas.openxmlformats.org/drawingml/2006/main">
+              <a:graphicData uri="http://schemas.openxmlformats.org/drawingml/2006/picture">
+                <pic:pic xmlns:pic="http://schemas.openxmlformats.org/drawingml/2006/picture">
+                  <pic:nvPicPr>
+                    <pic:cNvPr id="1" name=""/>
+                    <pic:cNvPicPr/>
+                  </pic:nvPicPr>
+                  <pic:blipFill>
+                    <a:blip r:embed="rId14"/>
+                    <a:stretch>
+                      <a:fillRect/>
+                    </a:stretch>
+                  </pic:blipFill>
+                  <pic:spPr>
+                    <a:xfrm>
+                      <a:off x="0" y="0"/>
                       <a:ext cx="5943600" cy="3197860"/>
                     </a:xfrm>
                     <a:prstGeom prst="rect">
@@ -417,7 +568,7 @@
       </w:r>
     </w:p>
     <w:sectPr>
-      <w:headerReference w:type="default" r:id="rId13"/>
+      <w:headerReference w:type="default" r:id="rId15"/>
       <w:pgSz w:w="12240" w:h="15840"/>
       <w:pgMar w:top="1440" w:right="1440" w:bottom="1440" w:left="1440" w:header="720" w:footer="720" w:gutter="0"/>
       <w:cols w:space="720"/>

</xml_diff>